<commit_message>
Add ORCID (0009-0001-3253-6972) to both manuscripts; rebuild all outputs
Co-Authored-By: Claude Opus 4.8 <noreply@anthropic.com>
</commit_message>
<xml_diff>
--- a/manuscript/CSC_marker_benchmark.docx
+++ b/manuscript/CSC_marker_benchmark.docx
@@ -51,6 +51,20 @@
       </w:r>
       <w:r>
         <w:t xml:space="preserve"> ¹Independent Researcher</w:t>
+      </w:r>
+    </w:p>
+    <w:p>
+      <w:pPr>
+        <w:jc w:val="center"/>
+      </w:pPr>
+      <w:r>
+        <w:rPr>
+          <w:b/>
+        </w:rPr>
+        <w:t>ORCID:</w:t>
+      </w:r>
+      <w:r>
+        <w:t xml:space="preserve"> 0009-0001-3253-6972</w:t>
       </w:r>
     </w:p>
     <w:p>

</xml_diff>